<commit_message>
feat: integrate mermaid processing into markdownDocx API
- Add `mermaid` option to MarkdownDocxOptions interface
- Automatically process mermaid diagrams when `mermaid.enabled: true`
- Update README documentation with mermaid API usage examples
</commit_message>
<xml_diff>
--- a/tests/markdown.docx
+++ b/tests/markdown.docx
@@ -927,7 +927,7 @@
       <w:r>
         <w:t xml:space="preserve">@mentions, #refs, </w:t>
       </w:r>
-      <w:hyperlink w:history="1" r:id="rId51jpghxslxy3uazacf9fe">
+      <w:hyperlink w:history="1" r:id="rIdfzmjxk2zo00x3q9qckbl_">
         <w:r>
           <w:rPr>
             <w:rStyle w:val="MdLink"/>
@@ -1152,7 +1152,7 @@
       <w:pPr>
         <w:pStyle w:val="MdParagraph"/>
       </w:pPr>
-      <w:hyperlink w:history="1" r:id="rIdq2egfrahbq3fpw_u02sfn">
+      <w:hyperlink w:history="1" r:id="rIdopjqhnzvaz9z2bp9qobb6">
         <w:r>
           <w:rPr>
             <w:rStyle w:val="MdLink"/>
@@ -1170,7 +1170,7 @@
       <w:pPr>
         <w:pStyle w:val="MdParagraph"/>
       </w:pPr>
-      <w:hyperlink w:history="1" r:id="rId1spyychuyrzyf5ifclrvl">
+      <w:hyperlink w:history="1" r:id="rIdbcevsrkvbphfgqu5nxyrg">
         <w:r>
           <w:rPr>
             <w:rStyle w:val="MdLink"/>
@@ -1188,7 +1188,7 @@
       <w:pPr>
         <w:pStyle w:val="MdParagraph"/>
       </w:pPr>
-      <w:hyperlink w:history="1" r:id="rId_szpvk9uttwbyamfr3bcz">
+      <w:hyperlink w:history="1" r:id="rIdvv5zbvfq0kxvws9tuowis">
         <w:r>
           <w:rPr>
             <w:rStyle w:val="MdLink"/>
@@ -1206,7 +1206,7 @@
       <w:pPr>
         <w:pStyle w:val="MdParagraph"/>
       </w:pPr>
-      <w:hyperlink w:history="1" r:id="rIdfuttqtw63fu2rsy_1ke_l">
+      <w:hyperlink w:history="1" r:id="rIdwock7fjn0vt1xckasscua">
         <w:r>
           <w:rPr>
             <w:rStyle w:val="MdLink"/>
@@ -1224,7 +1224,7 @@
       <w:pPr>
         <w:pStyle w:val="MdParagraph"/>
       </w:pPr>
-      <w:hyperlink w:history="1" r:id="rIdvizr1sgw3njexxd7kllzd">
+      <w:hyperlink w:history="1" r:id="rIdjfkuf31g1wo3qzjyyflje">
         <w:r>
           <w:rPr>
             <w:rStyle w:val="MdLink"/>
@@ -1245,7 +1245,7 @@
       <w:r>
         <w:t xml:space="preserve">Or leave it empty and use the </w:t>
       </w:r>
-      <w:hyperlink w:history="1" r:id="rId_r8phjfj8pfml40cfzhb1">
+      <w:hyperlink w:history="1" r:id="rId1j6lf2ohxyosv1q8jsupo">
         <w:r>
           <w:rPr>
             <w:rStyle w:val="MdLink"/>
@@ -1270,7 +1270,7 @@
         <w:t xml:space="preserve">URLs and URLs in angle brackets will automatically get turned into links.
 </w:t>
       </w:r>
-      <w:hyperlink w:history="1" r:id="rId1uxl9oowbi6-rvhvmkxqe">
+      <w:hyperlink w:history="1" r:id="rIdpravvluz6n0ibwlmjwduq">
         <w:r>
           <w:rPr>
             <w:rStyle w:val="MdLink"/>
@@ -1281,7 +1281,7 @@
       <w:r>
         <w:t xml:space="preserve"> or </w:t>
       </w:r>
-      <w:hyperlink w:history="1" r:id="rIdcpfsnkqczi8ar9x80icg1">
+      <w:hyperlink w:history="1" r:id="rIdsdp1n_hnzklmawsjcrwpo">
         <w:r>
           <w:rPr>
             <w:rStyle w:val="MdLink"/>
@@ -1747,7 +1747,7 @@
         <w:pStyle w:val="Heading1"/>
         <w:pStyle w:val="MdHeading1"/>
       </w:pPr>
-      <w:hyperlink w:history="1" r:id="rIdygb3hp8iancio8iwjr9gr">
+      <w:hyperlink w:history="1" r:id="rIdrhjvxsxpzsa8bj3ekcs-z">
         <w:r>
           <w:rPr>
             <w:rStyle w:val="MdLink"/>

</xml_diff>